<commit_message>
Ajuste de missing values
</commit_message>
<xml_diff>
--- a/TP2/Program_TP2_Grupo2.docx
+++ b/TP2/Program_TP2_Grupo2.docx
@@ -225,38 +225,16 @@
         </w:rPr>
         <w:t xml:space="preserve"> </w:t>
       </w:r>
-      <w:r>
-        <w:rPr>
-          <w:sz w:val="28"/>
-          <w:szCs w:val="28"/>
-        </w:rPr>
-        <w:t>https://github.com/alvarezmartin2411-debug/Big-Data-UBA--Grupo-2/</w:t>
-      </w:r>
-      <w:proofErr w:type="spellStart"/>
-      <w:r>
-        <w:rPr>
-          <w:sz w:val="28"/>
-          <w:szCs w:val="28"/>
-        </w:rPr>
-        <w:t>tree</w:t>
-      </w:r>
-      <w:proofErr w:type="spellEnd"/>
-      <w:r>
-        <w:rPr>
-          <w:sz w:val="28"/>
-          <w:szCs w:val="28"/>
-        </w:rPr>
-        <w:t>/</w:t>
-      </w:r>
-      <w:proofErr w:type="spellStart"/>
-      <w:r>
-        <w:rPr>
-          <w:sz w:val="28"/>
-          <w:szCs w:val="28"/>
-        </w:rPr>
-        <w:t>main</w:t>
-      </w:r>
-      <w:proofErr w:type="spellEnd"/>
+      <w:hyperlink r:id="rId7" w:history="1">
+        <w:r>
+          <w:rPr>
+            <w:rStyle w:val="Hipervnculo"/>
+            <w:sz w:val="28"/>
+            <w:szCs w:val="28"/>
+          </w:rPr>
+          <w:t>https://github.com/alvarezmartin2411-debug/Big-Data-UBA--Grupo-2/tree/main</w:t>
+        </w:r>
+      </w:hyperlink>
       <w:r>
         <w:rPr>
           <w:sz w:val="28"/>
@@ -298,39 +276,7 @@
           <w:sz w:val="28"/>
           <w:szCs w:val="28"/>
         </w:rPr>
-        <w:t>El presente trabajo práctico tiene como objetivo aplicar técnicas de análisis multivariado para explorar la estructura socioeconómica de los hogares a partir de los microdatos de la Encuesta Permanente de Hogares (EPH) para los años 2005 y 2025. A lo largo del ejercicio se construyen y analizan variables representativas del ingreso, la educación, la edad y las horas trabajadas, empleando herramientas como el Análisis de Componentes Principales (PCA), el método K-</w:t>
-      </w:r>
-      <w:proofErr w:type="spellStart"/>
-      <w:r>
-        <w:rPr>
-          <w:sz w:val="28"/>
-          <w:szCs w:val="28"/>
-        </w:rPr>
-        <w:t>means</w:t>
-      </w:r>
-      <w:proofErr w:type="spellEnd"/>
-      <w:r>
-        <w:rPr>
-          <w:sz w:val="28"/>
-          <w:szCs w:val="28"/>
-        </w:rPr>
-        <w:t xml:space="preserve"> y el </w:t>
-      </w:r>
-      <w:proofErr w:type="spellStart"/>
-      <w:r>
-        <w:rPr>
-          <w:sz w:val="28"/>
-          <w:szCs w:val="28"/>
-        </w:rPr>
-        <w:t>clustering</w:t>
-      </w:r>
-      <w:proofErr w:type="spellEnd"/>
-      <w:r>
-        <w:rPr>
-          <w:sz w:val="28"/>
-          <w:szCs w:val="28"/>
-        </w:rPr>
-        <w:t xml:space="preserve"> jerárquico. Estas técnicas permiten reducir la dimensionalidad de la información, identificar patrones de similitud entre individuos y examinar la capacidad de los modelos no supervisados para distinguir grupos sociales, incluyendo la condición de pobreza.</w:t>
+        <w:t>El presente trabajo práctico tiene como objetivo aplicar técnicas de análisis multivariado para explorar la estructura socioeconómica de los hogares a partir de los microdatos de la Encuesta Permanente de Hogares (EPH) para los años 2005 y 2025. A lo largo del ejercicio se construyen y analizan variables representativas del ingreso, la educación, la edad y las horas trabajadas, empleando herramientas como el Análisis de Componentes Principales (PCA), el método K-means y el clustering jerárquico. Estas técnicas permiten reducir la dimensionalidad de la información, identificar patrones de similitud entre individuos y examinar la capacidad de los modelos no supervisados para distinguir grupos sociales, incluyendo la condición de pobreza.</w:t>
       </w:r>
     </w:p>
     <w:p/>
@@ -397,7 +343,6 @@
         </w:rPr>
         <w:t xml:space="preserve">, donde la mayoría de las personas tiene menos de 40 años y la frecuencia disminuye con la edad. El Panel B muestra la distribución </w:t>
       </w:r>
-      <w:proofErr w:type="spellStart"/>
       <w:r>
         <w:rPr>
           <w:sz w:val="24"/>
@@ -410,15 +355,7 @@
           <w:sz w:val="24"/>
           <w:szCs w:val="24"/>
         </w:rPr>
-        <w:t>ernel</w:t>
-      </w:r>
-      <w:proofErr w:type="spellEnd"/>
-      <w:r>
-        <w:rPr>
-          <w:sz w:val="24"/>
-          <w:szCs w:val="24"/>
-        </w:rPr>
-        <w:t xml:space="preserve"> por condición de pobreza</w:t>
+        <w:t>ernel por condición de pobreza</w:t>
       </w:r>
       <w:r>
         <w:rPr>
@@ -532,7 +469,7 @@
                     <pic:cNvPicPr/>
                   </pic:nvPicPr>
                   <pic:blipFill>
-                    <a:blip r:embed="rId7"/>
+                    <a:blip r:embed="rId8"/>
                     <a:stretch>
                       <a:fillRect/>
                     </a:stretch>
@@ -1380,7 +1317,7 @@
                     <pic:cNvPicPr/>
                   </pic:nvPicPr>
                   <pic:blipFill>
-                    <a:blip r:embed="rId8"/>
+                    <a:blip r:embed="rId9"/>
                     <a:stretch>
                       <a:fillRect/>
                     </a:stretch>
@@ -2541,21 +2478,7 @@
               <w:rPr>
                 <w:rFonts w:eastAsia="Century Schoolbook" w:cstheme="minorHAnsi"/>
               </w:rPr>
-              <w:t xml:space="preserve">Cantidad de observaciones con </w:t>
-            </w:r>
-            <w:proofErr w:type="spellStart"/>
-            <w:r>
-              <w:rPr>
-                <w:rFonts w:eastAsia="Century Schoolbook" w:cstheme="minorHAnsi"/>
-              </w:rPr>
-              <w:t>NAs</w:t>
-            </w:r>
-            <w:proofErr w:type="spellEnd"/>
-            <w:r>
-              <w:rPr>
-                <w:rFonts w:eastAsia="Century Schoolbook" w:cstheme="minorHAnsi"/>
-              </w:rPr>
-              <w:t xml:space="preserve"> en la variable “Pobre”</w:t>
+              <w:t>Cantidad de observaciones con NAs en la variable “Pobre”</w:t>
             </w:r>
           </w:p>
         </w:tc>
@@ -3009,23 +2932,7 @@
                 <w:sz w:val="24"/>
                 <w:szCs w:val="24"/>
               </w:rPr>
-              <w:t xml:space="preserve">. Adicionalmente se observa correlación exacta entre ch06 y </w:t>
-            </w:r>
-            <w:proofErr w:type="gramStart"/>
-            <w:r>
-              <w:rPr>
-                <w:sz w:val="24"/>
-                <w:szCs w:val="24"/>
-              </w:rPr>
-              <w:t>edad2</w:t>
-            </w:r>
-            <w:proofErr w:type="gramEnd"/>
-            <w:r>
-              <w:rPr>
-                <w:sz w:val="24"/>
-                <w:szCs w:val="24"/>
-              </w:rPr>
-              <w:t xml:space="preserve"> pero esto es debido a que la primera es una transformación lineal de la segunda.</w:t>
+              <w:t>. Adicionalmente se observa correlación exacta entre ch06 y edad2 pero esto es debido a que la primera es una transformación lineal de la segunda.</w:t>
             </w:r>
             <w:r>
               <w:rPr>
@@ -3055,14 +2962,7 @@
                 <w:sz w:val="24"/>
                 <w:szCs w:val="24"/>
               </w:rPr>
-              <w:t xml:space="preserve">, -0.2) y entre educación e ITF </w:t>
-            </w:r>
-            <w:r>
-              <w:rPr>
-                <w:sz w:val="24"/>
-                <w:szCs w:val="24"/>
-              </w:rPr>
-              <w:t xml:space="preserve">(baja y </w:t>
+              <w:t xml:space="preserve">, -0.2) y entre educación e ITF (baja y </w:t>
             </w:r>
             <w:r>
               <w:rPr>
@@ -3078,14 +2978,7 @@
                 <w:sz w:val="24"/>
                 <w:szCs w:val="24"/>
               </w:rPr>
-              <w:t>, -0.2)</w:t>
-            </w:r>
-            <w:r>
-              <w:rPr>
-                <w:sz w:val="24"/>
-                <w:szCs w:val="24"/>
-              </w:rPr>
-              <w:t xml:space="preserve">. </w:t>
+              <w:t xml:space="preserve">, -0.2). </w:t>
             </w:r>
           </w:p>
         </w:tc>
@@ -3125,7 +3018,7 @@
                           <pic:cNvPicPr/>
                         </pic:nvPicPr>
                         <pic:blipFill rotWithShape="1">
-                          <a:blip r:embed="rId9"/>
+                          <a:blip r:embed="rId10"/>
                           <a:srcRect t="9817" r="14114"/>
                           <a:stretch>
                             <a:fillRect/>
@@ -3200,7 +3093,7 @@
                     <pic:cNvPicPr/>
                   </pic:nvPicPr>
                   <pic:blipFill>
-                    <a:blip r:embed="rId10" cstate="print">
+                    <a:blip r:embed="rId11" cstate="print">
                       <a:extLst>
                         <a:ext uri="{28A0092B-C50C-407E-A947-70E740481C1C}">
                           <a14:useLocalDpi xmlns:a14="http://schemas.microsoft.com/office/drawing/2010/main" val="0"/>
@@ -3302,7 +3195,7 @@
           <w:szCs w:val="28"/>
         </w:rPr>
         <w:drawing>
-          <wp:anchor distT="0" distB="0" distL="114300" distR="114300" simplePos="0" relativeHeight="251659264" behindDoc="0" locked="0" layoutInCell="1" allowOverlap="1" wp14:anchorId="110B6AE8" wp14:editId="53C17A74">
+          <wp:anchor distT="0" distB="0" distL="114300" distR="114300" simplePos="0" relativeHeight="251659264" behindDoc="0" locked="0" layoutInCell="1" allowOverlap="1" wp14:anchorId="110B6AE8" wp14:editId="6BE050ED">
             <wp:simplePos x="0" y="0"/>
             <wp:positionH relativeFrom="margin">
               <wp:align>right</wp:align>
@@ -3325,7 +3218,7 @@
                     <pic:cNvPicPr/>
                   </pic:nvPicPr>
                   <pic:blipFill rotWithShape="1">
-                    <a:blip r:embed="rId11" cstate="print">
+                    <a:blip r:embed="rId12" cstate="print">
                       <a:extLst>
                         <a:ext uri="{28A0092B-C50C-407E-A947-70E740481C1C}">
                           <a14:useLocalDpi xmlns:a14="http://schemas.microsoft.com/office/drawing/2010/main" val="0"/>
@@ -3387,39 +3280,7 @@
           <w:sz w:val="24"/>
           <w:szCs w:val="24"/>
         </w:rPr>
-        <w:t xml:space="preserve">El </w:t>
-      </w:r>
-      <w:proofErr w:type="spellStart"/>
-      <w:r>
-        <w:rPr>
-          <w:sz w:val="24"/>
-          <w:szCs w:val="24"/>
-        </w:rPr>
-        <w:t>biplot</w:t>
-      </w:r>
-      <w:proofErr w:type="spellEnd"/>
-      <w:r>
-        <w:rPr>
-          <w:sz w:val="24"/>
-          <w:szCs w:val="24"/>
-        </w:rPr>
-        <w:t xml:space="preserve"> de </w:t>
-      </w:r>
-      <w:proofErr w:type="spellStart"/>
-      <w:r>
-        <w:rPr>
-          <w:sz w:val="24"/>
-          <w:szCs w:val="24"/>
-        </w:rPr>
-        <w:t>loadings</w:t>
-      </w:r>
-      <w:proofErr w:type="spellEnd"/>
-      <w:r>
-        <w:rPr>
-          <w:sz w:val="24"/>
-          <w:szCs w:val="24"/>
-        </w:rPr>
-        <w:t xml:space="preserve"> permite interpretar qué variables tienen mayor peso en la construcción de los componentes principales. Se observa que el primer componente está explicado principalmente por la edad y su cuadrado, reflejando diferencias etarias en la muestra, mientras que el segundo componente está fuertemente asociado al ingreso total familiar y la cantidad de integrantes del hogar. A su vez, la educación y las horas trabajadas contribuyen de manera intermedia en ambos ejes. En conjunto, esto muestra que los factores demográficos y laborales se combinan con los ingresos para explicar la mayor parte de la variabilidad socioeconómica de los hogares.</w:t>
+        <w:t>El biplot de loadings permite interpretar qué variables tienen mayor peso en la construcción de los componentes principales. Se observa que el primer componente está explicado principalmente por la edad y su cuadrado, reflejando diferencias etarias en la muestra, mientras que el segundo componente está fuertemente asociado al ingreso total familiar y la cantidad de integrantes del hogar. A su vez, la educación y las horas trabajadas contribuyen de manera intermedia en ambos ejes. En conjunto, esto muestra que los factores demográficos y laborales se combinan con los ingresos para explicar la mayor parte de la variabilidad socioeconómica de los hogares.</w:t>
       </w:r>
     </w:p>
     <w:p>
@@ -3461,7 +3322,7 @@
                     <pic:cNvPicPr/>
                   </pic:nvPicPr>
                   <pic:blipFill>
-                    <a:blip r:embed="rId12">
+                    <a:blip r:embed="rId13">
                       <a:extLst>
                         <a:ext uri="{28A0092B-C50C-407E-A947-70E740481C1C}">
                           <a14:useLocalDpi xmlns:a14="http://schemas.microsoft.com/office/drawing/2010/main" val="0"/>
@@ -3609,43 +3470,7 @@
           <w:sz w:val="24"/>
           <w:szCs w:val="24"/>
         </w:rPr>
-        <w:t xml:space="preserve">Con dos grupos, la segmentación es muy general y básicamente divide a la población en jóvenes y adultos. Con cuatro </w:t>
-      </w:r>
-      <w:proofErr w:type="spellStart"/>
-      <w:proofErr w:type="gramStart"/>
-      <w:r>
-        <w:rPr>
-          <w:sz w:val="24"/>
-          <w:szCs w:val="24"/>
-        </w:rPr>
-        <w:t>clusters</w:t>
-      </w:r>
-      <w:proofErr w:type="spellEnd"/>
-      <w:proofErr w:type="gramEnd"/>
-      <w:r>
-        <w:rPr>
-          <w:sz w:val="24"/>
-          <w:szCs w:val="24"/>
-        </w:rPr>
-        <w:t xml:space="preserve"> se observa una segmentación más rica que permite distinguir subgrupos etarios con distintos niveles de ingreso, aportando mayor heterogeneidad. Finalmente, con diez </w:t>
-      </w:r>
-      <w:proofErr w:type="spellStart"/>
-      <w:proofErr w:type="gramStart"/>
-      <w:r>
-        <w:rPr>
-          <w:sz w:val="24"/>
-          <w:szCs w:val="24"/>
-        </w:rPr>
-        <w:t>clusters</w:t>
-      </w:r>
-      <w:proofErr w:type="spellEnd"/>
-      <w:proofErr w:type="gramEnd"/>
-      <w:r>
-        <w:rPr>
-          <w:sz w:val="24"/>
-          <w:szCs w:val="24"/>
-        </w:rPr>
-        <w:t xml:space="preserve"> la clasificación se vuelve más fragmentada, identificando perfiles muy </w:t>
+        <w:t xml:space="preserve">Con dos grupos, la segmentación es muy general y básicamente divide a la población en jóvenes y adultos. Con cuatro clusters se observa una segmentación más rica que permite distinguir subgrupos etarios con distintos niveles de ingreso, aportando mayor heterogeneidad. Finalmente, con diez clusters la clasificación se vuelve más fragmentada, identificando perfiles muy </w:t>
       </w:r>
       <w:r>
         <w:rPr>
@@ -3659,25 +3484,7 @@
           <w:sz w:val="24"/>
           <w:szCs w:val="24"/>
         </w:rPr>
-        <w:t xml:space="preserve"> pero perdiendo claridad interpretativa. En conjunto, los resultados sugieren que una partición intermedia (por ejemplo, cuatro </w:t>
-      </w:r>
-      <w:proofErr w:type="spellStart"/>
-      <w:proofErr w:type="gramStart"/>
-      <w:r>
-        <w:rPr>
-          <w:sz w:val="24"/>
-          <w:szCs w:val="24"/>
-        </w:rPr>
-        <w:t>clusters</w:t>
-      </w:r>
-      <w:proofErr w:type="spellEnd"/>
-      <w:proofErr w:type="gramEnd"/>
-      <w:r>
-        <w:rPr>
-          <w:sz w:val="24"/>
-          <w:szCs w:val="24"/>
-        </w:rPr>
-        <w:t>) resulta más adecuada para representar la diversidad socioeconómica sin perder simplicidad.</w:t>
+        <w:t xml:space="preserve"> pero perdiendo claridad interpretativa. En conjunto, los resultados sugieren que una partición intermedia (por ejemplo, cuatro clusters) resulta más adecuada para representar la diversidad socioeconómica sin perder simplicidad.</w:t>
       </w:r>
     </w:p>
     <w:p>
@@ -3713,7 +3520,7 @@
                     <pic:cNvPicPr/>
                   </pic:nvPicPr>
                   <pic:blipFill>
-                    <a:blip r:embed="rId13"/>
+                    <a:blip r:embed="rId14"/>
                     <a:stretch>
                       <a:fillRect/>
                     </a:stretch>
@@ -3773,7 +3580,7 @@
                     <pic:cNvPicPr/>
                   </pic:nvPicPr>
                   <pic:blipFill rotWithShape="1">
-                    <a:blip r:embed="rId14">
+                    <a:blip r:embed="rId15">
                       <a:extLst>
                         <a:ext uri="{28A0092B-C50C-407E-A947-70E740481C1C}">
                           <a14:useLocalDpi xmlns:a14="http://schemas.microsoft.com/office/drawing/2010/main" val="0"/>
@@ -3835,25 +3642,7 @@
           <w:sz w:val="24"/>
           <w:szCs w:val="24"/>
         </w:rPr>
-        <w:t xml:space="preserve">El gráfico muestra que la inercia disminuye fuertemente hasta alrededor de k=3 o k=4, a partir de lo cual la reducción es cada vez más marginal. Esto sugiere que el número óptimo de </w:t>
-      </w:r>
-      <w:proofErr w:type="spellStart"/>
-      <w:proofErr w:type="gramStart"/>
-      <w:r>
-        <w:rPr>
-          <w:sz w:val="24"/>
-          <w:szCs w:val="24"/>
-        </w:rPr>
-        <w:t>clusters</w:t>
-      </w:r>
-      <w:proofErr w:type="spellEnd"/>
-      <w:proofErr w:type="gramEnd"/>
-      <w:r>
-        <w:rPr>
-          <w:sz w:val="24"/>
-          <w:szCs w:val="24"/>
-        </w:rPr>
-        <w:t xml:space="preserve"> en la región se encuentra entre 3 y 4. </w:t>
+        <w:t xml:space="preserve">El gráfico muestra que la inercia disminuye fuertemente hasta alrededor de k=3 o k=4, a partir de lo cual la reducción es cada vez más marginal. Esto sugiere que el número óptimo de clusters en la región se encuentra entre 3 y 4. </w:t>
       </w:r>
       <w:r>
         <w:rPr>
@@ -3893,73 +3682,7 @@
           <w:sz w:val="24"/>
           <w:szCs w:val="24"/>
         </w:rPr>
-        <w:t xml:space="preserve">El </w:t>
-      </w:r>
-      <w:proofErr w:type="spellStart"/>
-      <w:r>
-        <w:rPr>
-          <w:sz w:val="24"/>
-          <w:szCs w:val="24"/>
-        </w:rPr>
-        <w:t>dendrograma</w:t>
-      </w:r>
-      <w:proofErr w:type="spellEnd"/>
-      <w:r>
-        <w:rPr>
-          <w:sz w:val="24"/>
-          <w:szCs w:val="24"/>
-        </w:rPr>
-        <w:t xml:space="preserve"> del </w:t>
-      </w:r>
-      <w:proofErr w:type="spellStart"/>
-      <w:r>
-        <w:rPr>
-          <w:sz w:val="24"/>
-          <w:szCs w:val="24"/>
-        </w:rPr>
-        <w:t>clustering</w:t>
-      </w:r>
-      <w:proofErr w:type="spellEnd"/>
-      <w:r>
-        <w:rPr>
-          <w:sz w:val="24"/>
-          <w:szCs w:val="24"/>
-        </w:rPr>
-        <w:t xml:space="preserve"> jerárquico permite observar cómo se agrupan las observaciones en función de su similitud. Se aprecia que a niveles bajos de disimilitud se forman numerosos grupos pequeños, que luego se van unificando en conglomerados más grandes. Al cortar el árbol en un punto intermedio de la escala (por ejemplo, disimilitud ≈ 4), se obtendrían dos grandes </w:t>
-      </w:r>
-      <w:proofErr w:type="spellStart"/>
-      <w:proofErr w:type="gramStart"/>
-      <w:r>
-        <w:rPr>
-          <w:sz w:val="24"/>
-          <w:szCs w:val="24"/>
-        </w:rPr>
-        <w:t>clusters</w:t>
-      </w:r>
-      <w:proofErr w:type="spellEnd"/>
-      <w:proofErr w:type="gramEnd"/>
-      <w:r>
-        <w:rPr>
-          <w:sz w:val="24"/>
-          <w:szCs w:val="24"/>
-        </w:rPr>
-        <w:t xml:space="preserve"> que dividen a la muestra en grupos relativamente diferenciados. Sin embargo, al igual que en K-</w:t>
-      </w:r>
-      <w:proofErr w:type="spellStart"/>
-      <w:r>
-        <w:rPr>
-          <w:sz w:val="24"/>
-          <w:szCs w:val="24"/>
-        </w:rPr>
-        <w:t>means</w:t>
-      </w:r>
-      <w:proofErr w:type="spellEnd"/>
-      <w:r>
-        <w:rPr>
-          <w:sz w:val="24"/>
-          <w:szCs w:val="24"/>
-        </w:rPr>
-        <w:t>, la separación no coincide de manera exacta con la condición de pobreza, sino que refleja más bien diferencias generales en edad, educación y nivel de ingresos</w:t>
+        <w:t>El dendrograma del clustering jerárquico permite observar cómo se agrupan las observaciones en función de su similitud. Se aprecia que a niveles bajos de disimilitud se forman numerosos grupos pequeños, que luego se van unificando en conglomerados más grandes. Al cortar el árbol en un punto intermedio de la escala (por ejemplo, disimilitud ≈ 4), se obtendrían dos grandes clusters que dividen a la muestra en grupos relativamente diferenciados. Sin embargo, al igual que en K-means, la separación no coincide de manera exacta con la condición de pobreza, sino que refleja más bien diferencias generales en edad, educación y nivel de ingresos</w:t>
       </w:r>
       <w:r>
         <w:rPr>
@@ -4010,7 +3733,7 @@
                     <pic:cNvPicPr/>
                   </pic:nvPicPr>
                   <pic:blipFill>
-                    <a:blip r:embed="rId15"/>
+                    <a:blip r:embed="rId16"/>
                     <a:stretch>
                       <a:fillRect/>
                     </a:stretch>
@@ -4048,8 +3771,8 @@
       </w:pPr>
     </w:p>
     <w:sectPr>
-      <w:headerReference w:type="default" r:id="rId16"/>
-      <w:footerReference w:type="default" r:id="rId17"/>
+      <w:headerReference w:type="default" r:id="rId17"/>
+      <w:footerReference w:type="default" r:id="rId18"/>
       <w:pgSz w:w="11906" w:h="16838"/>
       <w:pgMar w:top="1440" w:right="1440" w:bottom="1440" w:left="1440" w:header="708" w:footer="708" w:gutter="0"/>
       <w:cols w:space="708"/>
@@ -4169,13 +3892,8 @@
       <w:t>2</w:t>
     </w:r>
     <w:r>
-      <w:t xml:space="preserve"> – Godino, Sulca y </w:t>
+      <w:t xml:space="preserve"> – Godino, Sulca y Alvarez</w:t>
     </w:r>
-    <w:proofErr w:type="spellStart"/>
-    <w:r>
-      <w:t>Alvarez</w:t>
-    </w:r>
-    <w:proofErr w:type="spellEnd"/>
   </w:p>
 </w:hdr>
 </file>
@@ -5160,6 +4878,29 @@
       </w:tblBorders>
     </w:tblPr>
   </w:style>
+  <w:style w:type="character" w:styleId="Hipervnculo">
+    <w:name w:val="Hyperlink"/>
+    <w:basedOn w:val="Fuentedeprrafopredeter"/>
+    <w:uiPriority w:val="99"/>
+    <w:unhideWhenUsed/>
+    <w:rsid w:val="00C41D95"/>
+    <w:rPr>
+      <w:color w:val="0563C1" w:themeColor="hyperlink"/>
+      <w:u w:val="single"/>
+    </w:rPr>
+  </w:style>
+  <w:style w:type="character" w:styleId="Mencinsinresolver">
+    <w:name w:val="Unresolved Mention"/>
+    <w:basedOn w:val="Fuentedeprrafopredeter"/>
+    <w:uiPriority w:val="99"/>
+    <w:semiHidden/>
+    <w:unhideWhenUsed/>
+    <w:rsid w:val="00C41D95"/>
+    <w:rPr>
+      <w:color w:val="605E5C"/>
+      <w:shd w:val="clear" w:color="auto" w:fill="E1DFDD"/>
+    </w:rPr>
+  </w:style>
 </w:styles>
 </file>
 

</xml_diff>